<commit_message>
Workshop: Step 4b — steward judgment lab (work the Find similar list)
New exercise between the agents and Govern, born from live use: run
Find similar at the 0.60 teaching threshold and work the real CSCU
pairs — the FK-linked Employee ID trio as a policy decision (one
concept vs role-qualified terms, applied consistently and mirrored in
the Dictionary via the AI fold advisor), the classic near-name traps
dismissed with reasons (Dr/Cr Amount, Balance vs Available,
internal vs External Account Number, Branch City vs County, KYC vs
SAR Status), the June Debits/Credits junk unkept, then the threshold
raised to 0.75 as the working setting. Checkpoint: you dismissed more
than you merged. docx regenerated from the master, Word-COM verified.

Co-Authored-By: Claude Fable 5 <noreply@anthropic.com>
</commit_message>
<xml_diff>
--- a/courseware/CSCU/Glossary/Workshop-Glossary-Generator-CSCU.docx
+++ b/courseware/CSCU/Glossary/Workshop-Glossary-Generator-CSCU.docx
@@ -1533,6 +1533,396 @@
       </w:r>
       <w:r>
         <w:t xml:space="preserve"> with the merge withheld.</w:t>
+      </w:r>
+    </w:p>
+    <w:p>
+      <w:pPr>
+        <w:pStyle w:val="Heading2"/>
+      </w:pPr>
+      <w:r>
+        <w:t xml:space="preserve">Step 4b — Steward judgment lab: work the </w:t>
+      </w:r>
+      <w:r>
+        <w:rPr>
+          <w:i/>
+          <w:iCs/>
+        </w:rPr>
+        <w:t xml:space="preserve">Find similar</w:t>
+      </w:r>
+      <w:r>
+        <w:t xml:space="preserve"> list</w:t>
+      </w:r>
+    </w:p>
+    <w:p>
+      <w:pPr>
+        <w:spacing w:after="120"/>
+      </w:pPr>
+      <w:r>
+        <w:t xml:space="preserve">Run </w:t>
+      </w:r>
+      <w:r>
+        <w:rPr>
+          <w:b/>
+          <w:bCs/>
+        </w:rPr>
+        <w:t xml:space="preserve">Find similar</w:t>
+      </w:r>
+      <w:r>
+        <w:t xml:space="preserve"> with the threshold at its default </w:t>
+      </w:r>
+      <w:r>
+        <w:rPr>
+          <w:b/>
+          <w:bCs/>
+        </w:rPr>
+        <w:t xml:space="preserve">0.60</w:t>
+      </w:r>
+      <w:r>
+        <w:t xml:space="preserve"> and merge nothing yet. The point of this exercise: the advisor supplies </w:t>
+      </w:r>
+      <w:r>
+        <w:rPr>
+          <w:i/>
+          <w:iCs/>
+        </w:rPr>
+        <w:t xml:space="preserve">evidence</w:t>
+      </w:r>
+      <w:r>
+        <w:t xml:space="preserve">; the steward supplies </w:t>
+      </w:r>
+      <w:r>
+        <w:rPr>
+          <w:i/>
+          <w:iCs/>
+        </w:rPr>
+        <w:t xml:space="preserve">meaning</w:t>
+      </w:r>
+      <w:r>
+        <w:t xml:space="preserve"> — and at 0.60 the list deliberately contains both. Work it top-down:</w:t>
+      </w:r>
+    </w:p>
+    <w:p>
+      <w:pPr>
+        <w:pStyle w:val="ListParagraph"/>
+        <w:numPr>
+          <w:ilvl w:val="0"/>
+          <w:numId w:val="100"/>
+        </w:numPr>
+        <w:spacing w:after="80" w:line="264" w:lineRule="auto"/>
+      </w:pPr>
+      <w:r>
+        <w:rPr>
+          <w:b/>
+          <w:bCs/>
+        </w:rPr>
+        <w:t xml:space="preserve">The strong trio.</w:t>
+      </w:r>
+      <w:r>
+        <w:t xml:space="preserve"> </w:t>
+      </w:r>
+      <w:r>
+        <w:rPr>
+          <w:rFonts w:ascii="Consolas" w:hAnsi="Consolas"/>
+          <w:color w:val="0A5560"/>
+          <w:sz w:val="20"/>
+          <w:szCs w:val="20"/>
+        </w:rPr>
+        <w:t xml:space="preserve">Employee ID ← Manager Employee ID / Reviewer Employee ID / Filed By Employee ID</w:t>
+      </w:r>
+      <w:r>
+        <w:t xml:space="preserve"> — each justified by a foreign key (</w:t>
+      </w:r>
+      <w:r>
+        <w:rPr>
+          <w:i/>
+          <w:iCs/>
+        </w:rPr>
+        <w:t xml:space="preserve">"same concept by construction"</w:t>
+      </w:r>
+      <w:r>
+        <w:t xml:space="preserve">). The FK proves the columns share a value domain: they all hold employee ids. Whether they are one </w:t>
+      </w:r>
+      <w:r>
+        <w:rPr>
+          <w:b/>
+          <w:bCs/>
+        </w:rPr>
+        <w:t xml:space="preserve">term</w:t>
+      </w:r>
+      <w:r>
+        <w:t xml:space="preserve"> is a policy decision the tool cannot make:</w:t>
+      </w:r>
+    </w:p>
+    <w:p>
+      <w:pPr>
+        <w:pStyle w:val="ListParagraph"/>
+        <w:numPr>
+          <w:ilvl w:val="0"/>
+          <w:numId w:val="2"/>
+        </w:numPr>
+        <w:ind w:left="1080"/>
+        <w:spacing w:after="60"/>
+      </w:pPr>
+      <w:r>
+        <w:rPr>
+          <w:i/>
+          <w:iCs/>
+        </w:rPr>
+        <w:t xml:space="preserve">One concept, many columns</w:t>
+      </w:r>
+      <w:r>
+        <w:t xml:space="preserve"> (PDC-native): merge all three — the </w:t>
+      </w:r>
+      <w:r>
+        <w:rPr>
+          <w:rFonts w:ascii="Consolas" w:hAnsi="Consolas"/>
+          <w:color w:val="0A5560"/>
+          <w:sz w:val="20"/>
+          <w:szCs w:val="20"/>
+        </w:rPr>
+        <w:t xml:space="preserve">mgr_emp_id</w:t>
+      </w:r>
+      <w:r>
+        <w:t xml:space="preserve"> column simply links to </w:t>
+      </w:r>
+      <w:r>
+        <w:rPr>
+          <w:b/>
+          <w:bCs/>
+        </w:rPr>
+        <w:t xml:space="preserve">Employee ID</w:t>
+      </w:r>
+      <w:r>
+        <w:t xml:space="preserve">.</w:t>
+      </w:r>
+    </w:p>
+    <w:p>
+      <w:pPr>
+        <w:pStyle w:val="ListParagraph"/>
+        <w:numPr>
+          <w:ilvl w:val="0"/>
+          <w:numId w:val="2"/>
+        </w:numPr>
+        <w:ind w:left="1080"/>
+        <w:spacing w:after="60"/>
+      </w:pPr>
+      <w:r>
+        <w:rPr>
+          <w:i/>
+          <w:iCs/>
+        </w:rPr>
+        <w:t xml:space="preserve">Role-qualified terms</w:t>
+      </w:r>
+      <w:r>
+        <w:t xml:space="preserve">: dismiss all three — </w:t>
+      </w:r>
+      <w:r>
+        <w:rPr>
+          <w:b/>
+          <w:bCs/>
+        </w:rPr>
+        <w:t xml:space="preserve">Manager Employee ID</w:t>
+      </w:r>
+      <w:r>
+        <w:t xml:space="preserve"> carries meaning ("who approves") the bare identifier doesn't.</w:t>
+      </w:r>
+    </w:p>
+    <w:p>
+      <w:pPr>
+        <w:spacing w:after="120"/>
+      </w:pPr>
+      <w:r>
+        <w:t xml:space="preserve">Either is defensible; deciding the three </w:t>
+      </w:r>
+      <w:r>
+        <w:rPr>
+          <w:b/>
+          <w:bCs/>
+        </w:rPr>
+        <w:t xml:space="preserve">inconsistently</w:t>
+      </w:r>
+      <w:r>
+        <w:t xml:space="preserve"> is not. Pick a policy, apply it to all three, record it in the surviving term's definition. If you merged, open the Dictionary page and run the </w:t>
+      </w:r>
+      <w:r>
+        <w:rPr>
+          <w:b/>
+          <w:bCs/>
+        </w:rPr>
+        <w:t xml:space="preserve">AI fold advisor</w:t>
+      </w:r>
+      <w:r>
+        <w:t xml:space="preserve"> so the governed vocabulary folds the same way — the grid and the vocabulary must tell one story.</w:t>
+      </w:r>
+    </w:p>
+    <w:p>
+      <w:pPr>
+        <w:pStyle w:val="ListParagraph"/>
+        <w:numPr>
+          <w:ilvl w:val="0"/>
+          <w:numId w:val="101"/>
+        </w:numPr>
+        <w:spacing w:after="80" w:line="264" w:lineRule="auto"/>
+      </w:pPr>
+      <w:r>
+        <w:rPr>
+          <w:b/>
+          <w:bCs/>
+        </w:rPr>
+        <w:t xml:space="preserve">The classic traps — dismiss each, and say why out loud:</w:t>
+      </w:r>
+      <w:r>
+        <w:t xml:space="preserve"> </w:t>
+      </w:r>
+      <w:r>
+        <w:rPr>
+          <w:rFonts w:ascii="Consolas" w:hAnsi="Consolas"/>
+          <w:color w:val="0A5560"/>
+          <w:sz w:val="20"/>
+          <w:szCs w:val="20"/>
+        </w:rPr>
+        <w:t xml:space="preserve">Balance Amount ← Available Balance Amount</w:t>
+      </w:r>
+      <w:r>
+        <w:t xml:space="preserve"> (ledger vs available); </w:t>
+      </w:r>
+      <w:r>
+        <w:rPr>
+          <w:rFonts w:ascii="Consolas" w:hAnsi="Consolas"/>
+          <w:color w:val="0A5560"/>
+          <w:sz w:val="20"/>
+          <w:szCs w:val="20"/>
+        </w:rPr>
+        <w:t xml:space="preserve">Account Number ← External Account Number</w:t>
+      </w:r>
+      <w:r>
+        <w:t xml:space="preserve"> (ours vs the counterparty's); </w:t>
+      </w:r>
+      <w:r>
+        <w:rPr>
+          <w:rFonts w:ascii="Consolas" w:hAnsi="Consolas"/>
+          <w:color w:val="0A5560"/>
+          <w:sz w:val="20"/>
+          <w:szCs w:val="20"/>
+        </w:rPr>
+        <w:t xml:space="preserve">Dr Amount ← Cr Amount</w:t>
+      </w:r>
+      <w:r>
+        <w:t xml:space="preserve"> (opposites!); </w:t>
+      </w:r>
+      <w:r>
+        <w:rPr>
+          <w:rFonts w:ascii="Consolas" w:hAnsi="Consolas"/>
+          <w:color w:val="0A5560"/>
+          <w:sz w:val="20"/>
+          <w:szCs w:val="20"/>
+        </w:rPr>
+        <w:t xml:space="preserve">Branch City ← Branch County</w:t>
+      </w:r>
+      <w:r>
+        <w:t xml:space="preserve">; </w:t>
+      </w:r>
+      <w:r>
+        <w:rPr>
+          <w:rFonts w:ascii="Consolas" w:hAnsi="Consolas"/>
+          <w:color w:val="0A5560"/>
+          <w:sz w:val="20"/>
+          <w:szCs w:val="20"/>
+        </w:rPr>
+        <w:t xml:space="preserve">KYC Status ← SAR Status</w:t>
+      </w:r>
+      <w:r>
+        <w:t xml:space="preserve"> (different regulatory processes). High string similarity, different business meaning. </w:t>
+      </w:r>
+      <w:r>
+        <w:rPr>
+          <w:b/>
+          <w:bCs/>
+        </w:rPr>
+        <w:t xml:space="preserve">Dismissing is the review</w:t>
+      </w:r>
+      <w:r>
+        <w:t xml:space="preserve"> — each dismissal is a recorded decision the audit can defend.</w:t>
+      </w:r>
+    </w:p>
+    <w:p>
+      <w:pPr>
+        <w:pStyle w:val="ListParagraph"/>
+        <w:numPr>
+          <w:ilvl w:val="0"/>
+          <w:numId w:val="101"/>
+        </w:numPr>
+        <w:spacing w:after="80" w:line="264" w:lineRule="auto"/>
+      </w:pPr>
+      <w:r>
+        <w:rPr>
+          <w:b/>
+          <w:bCs/>
+        </w:rPr>
+        <w:t xml:space="preserve">The junk pair.</w:t>
+      </w:r>
+      <w:r>
+        <w:t xml:space="preserve"> </w:t>
+      </w:r>
+      <w:r>
+        <w:rPr>
+          <w:rFonts w:ascii="Consolas" w:hAnsi="Consolas"/>
+          <w:color w:val="0A5560"/>
+          <w:sz w:val="20"/>
+          <w:szCs w:val="20"/>
+        </w:rPr>
+        <w:t xml:space="preserve">June Debits ← June Credits</w:t>
+      </w:r>
+      <w:r>
+        <w:t xml:space="preserve"> — neither merge nor dismiss: period-specific spreadsheet noise. Untick their </w:t>
+      </w:r>
+      <w:r>
+        <w:rPr>
+          <w:b/>
+          <w:bCs/>
+        </w:rPr>
+        <w:t xml:space="preserve">Keep</w:t>
+      </w:r>
+      <w:r>
+        <w:t xml:space="preserve"> boxes; they should never reach PDC at all.</w:t>
+      </w:r>
+    </w:p>
+    <w:p>
+      <w:pPr>
+        <w:pStyle w:val="ListParagraph"/>
+        <w:numPr>
+          <w:ilvl w:val="0"/>
+          <w:numId w:val="101"/>
+        </w:numPr>
+        <w:spacing w:after="80" w:line="264" w:lineRule="auto"/>
+      </w:pPr>
+      <w:r>
+        <w:t xml:space="preserve">Drag the </w:t>
+      </w:r>
+      <w:r>
+        <w:rPr>
+          <w:b/>
+          <w:bCs/>
+        </w:rPr>
+        <w:t xml:space="preserve">threshold to ~0.75</w:t>
+      </w:r>
+      <w:r>
+        <w:t xml:space="preserve"> and watch the noise fall away — that is the working setting for routine passes; 0.60 was the teaching setting.</w:t>
+      </w:r>
+    </w:p>
+    <w:p>
+      <w:pPr>
+        <w:spacing w:after="120"/>
+      </w:pPr>
+      <w:r>
+        <w:rPr>
+          <w:b/>
+          <w:bCs/>
+        </w:rPr>
+        <w:t xml:space="preserve">Checkpoint:</w:t>
+      </w:r>
+      <w:r>
+        <w:t xml:space="preserve"> you dismissed more than you merged. A cohort that merges everything the advisor suggests has missed the lesson.</w:t>
       </w:r>
     </w:p>
     <w:p>
@@ -4037,6 +4427,18 @@
   </w:num>
   <w:num w:numId="6" w16cid:durableId="1962105193">
     <w:abstractNumId w:val="3"/>
+  </w:num>
+  <w:num w:numId="100">
+    <w:abstractNumId w:val="23"/>
+    <w:lvlOverride w:ilvl="0">
+      <w:startOverride w:val="1"/>
+    </w:lvlOverride>
+  </w:num>
+  <w:num w:numId="101">
+    <w:abstractNumId w:val="23"/>
+    <w:lvlOverride w:ilvl="0">
+      <w:startOverride w:val="1"/>
+    </w:lvlOverride>
   </w:num>
 </w:numbering>
 </file>

</xml_diff>